<commit_message>
Entityframework: Added; Updated everything with EF
</commit_message>
<xml_diff>
--- a/DokuUndAufgabe.docx
+++ b/DokuUndAufgabe.docx
@@ -318,7 +318,9 @@
               <w:tab w:val="right" w:leader="dot" w:pos="10456"/>
             </w:tabs>
             <w:rPr>
+              <w:rFonts w:eastAsiaTheme="minorEastAsia"/>
               <w:noProof/>
+              <w:lang w:eastAsia="de-CH"/>
             </w:rPr>
           </w:pPr>
           <w:r>
@@ -330,7 +332,7 @@
           <w:r>
             <w:fldChar w:fldCharType="separate"/>
           </w:r>
-          <w:hyperlink w:anchor="_Toc236923653" w:history="1">
+          <w:hyperlink w:anchor="_Toc237261053" w:history="1">
             <w:r>
               <w:rPr>
                 <w:rStyle w:val="Hyperlink"/>
@@ -357,7 +359,7 @@
                 <w:noProof/>
                 <w:webHidden/>
               </w:rPr>
-              <w:instrText xml:space="preserve"> PAGEREF _Toc236923653 \h </w:instrText>
+              <w:instrText xml:space="preserve"> PAGEREF _Toc237261053 \h </w:instrText>
             </w:r>
             <w:r>
               <w:rPr>
@@ -395,10 +397,12 @@
               <w:tab w:val="right" w:leader="dot" w:pos="10456"/>
             </w:tabs>
             <w:rPr>
+              <w:rFonts w:eastAsiaTheme="minorEastAsia"/>
               <w:noProof/>
+              <w:lang w:eastAsia="de-CH"/>
             </w:rPr>
           </w:pPr>
-          <w:hyperlink w:anchor="_Toc236923654" w:history="1">
+          <w:hyperlink w:anchor="_Toc237261054" w:history="1">
             <w:r>
               <w:rPr>
                 <w:rStyle w:val="Hyperlink"/>
@@ -425,7 +429,7 @@
                 <w:noProof/>
                 <w:webHidden/>
               </w:rPr>
-              <w:instrText xml:space="preserve"> PAGEREF _Toc236923654 \h </w:instrText>
+              <w:instrText xml:space="preserve"> PAGEREF _Toc237261054 \h </w:instrText>
             </w:r>
             <w:r>
               <w:rPr>
@@ -463,10 +467,12 @@
               <w:tab w:val="right" w:leader="dot" w:pos="10456"/>
             </w:tabs>
             <w:rPr>
+              <w:rFonts w:eastAsiaTheme="minorEastAsia"/>
               <w:noProof/>
+              <w:lang w:eastAsia="de-CH"/>
             </w:rPr>
           </w:pPr>
-          <w:hyperlink w:anchor="_Toc236923655" w:history="1">
+          <w:hyperlink w:anchor="_Toc237261055" w:history="1">
             <w:r>
               <w:rPr>
                 <w:rStyle w:val="Hyperlink"/>
@@ -493,7 +499,7 @@
                 <w:noProof/>
                 <w:webHidden/>
               </w:rPr>
-              <w:instrText xml:space="preserve"> PAGEREF _Toc236923655 \h </w:instrText>
+              <w:instrText xml:space="preserve"> PAGEREF _Toc237261055 \h </w:instrText>
             </w:r>
             <w:r>
               <w:rPr>
@@ -525,6 +531,496 @@
           </w:hyperlink>
         </w:p>
         <w:p>
+          <w:pPr>
+            <w:pStyle w:val="Verzeichnis1"/>
+            <w:tabs>
+              <w:tab w:val="right" w:leader="dot" w:pos="10456"/>
+            </w:tabs>
+            <w:rPr>
+              <w:rFonts w:eastAsiaTheme="minorEastAsia"/>
+              <w:noProof/>
+              <w:lang w:eastAsia="de-CH"/>
+            </w:rPr>
+          </w:pPr>
+          <w:hyperlink w:anchor="_Toc237261056" w:history="1">
+            <w:r>
+              <w:rPr>
+                <w:rStyle w:val="Hyperlink"/>
+                <w:noProof/>
+              </w:rPr>
+              <w:t>4. Geplante Daten</w:t>
+            </w:r>
+            <w:r>
+              <w:rPr>
+                <w:noProof/>
+                <w:webHidden/>
+              </w:rPr>
+              <w:tab/>
+            </w:r>
+            <w:r>
+              <w:rPr>
+                <w:noProof/>
+                <w:webHidden/>
+              </w:rPr>
+              <w:fldChar w:fldCharType="begin"/>
+            </w:r>
+            <w:r>
+              <w:rPr>
+                <w:noProof/>
+                <w:webHidden/>
+              </w:rPr>
+              <w:instrText xml:space="preserve"> PAGEREF _Toc237261056 \h </w:instrText>
+            </w:r>
+            <w:r>
+              <w:rPr>
+                <w:noProof/>
+                <w:webHidden/>
+              </w:rPr>
+            </w:r>
+            <w:r>
+              <w:rPr>
+                <w:noProof/>
+                <w:webHidden/>
+              </w:rPr>
+              <w:fldChar w:fldCharType="separate"/>
+            </w:r>
+            <w:r>
+              <w:rPr>
+                <w:noProof/>
+                <w:webHidden/>
+              </w:rPr>
+              <w:t>7</w:t>
+            </w:r>
+            <w:r>
+              <w:rPr>
+                <w:noProof/>
+                <w:webHidden/>
+              </w:rPr>
+              <w:fldChar w:fldCharType="end"/>
+            </w:r>
+          </w:hyperlink>
+        </w:p>
+        <w:p>
+          <w:pPr>
+            <w:pStyle w:val="Verzeichnis1"/>
+            <w:tabs>
+              <w:tab w:val="right" w:leader="dot" w:pos="10456"/>
+            </w:tabs>
+            <w:rPr>
+              <w:rFonts w:eastAsiaTheme="minorEastAsia"/>
+              <w:noProof/>
+              <w:lang w:eastAsia="de-CH"/>
+            </w:rPr>
+          </w:pPr>
+          <w:hyperlink w:anchor="_Toc237261057" w:history="1">
+            <w:r>
+              <w:rPr>
+                <w:rStyle w:val="Hyperlink"/>
+                <w:noProof/>
+              </w:rPr>
+              <w:t>5. Benutzeroberfläche</w:t>
+            </w:r>
+            <w:r>
+              <w:rPr>
+                <w:noProof/>
+                <w:webHidden/>
+              </w:rPr>
+              <w:tab/>
+            </w:r>
+            <w:r>
+              <w:rPr>
+                <w:noProof/>
+                <w:webHidden/>
+              </w:rPr>
+              <w:fldChar w:fldCharType="begin"/>
+            </w:r>
+            <w:r>
+              <w:rPr>
+                <w:noProof/>
+                <w:webHidden/>
+              </w:rPr>
+              <w:instrText xml:space="preserve"> PAGEREF _Toc237261057 \h </w:instrText>
+            </w:r>
+            <w:r>
+              <w:rPr>
+                <w:noProof/>
+                <w:webHidden/>
+              </w:rPr>
+            </w:r>
+            <w:r>
+              <w:rPr>
+                <w:noProof/>
+                <w:webHidden/>
+              </w:rPr>
+              <w:fldChar w:fldCharType="separate"/>
+            </w:r>
+            <w:r>
+              <w:rPr>
+                <w:noProof/>
+                <w:webHidden/>
+              </w:rPr>
+              <w:t>9</w:t>
+            </w:r>
+            <w:r>
+              <w:rPr>
+                <w:noProof/>
+                <w:webHidden/>
+              </w:rPr>
+              <w:fldChar w:fldCharType="end"/>
+            </w:r>
+          </w:hyperlink>
+        </w:p>
+        <w:p>
+          <w:pPr>
+            <w:pStyle w:val="Verzeichnis1"/>
+            <w:tabs>
+              <w:tab w:val="right" w:leader="dot" w:pos="10456"/>
+            </w:tabs>
+            <w:rPr>
+              <w:rFonts w:eastAsiaTheme="minorEastAsia"/>
+              <w:noProof/>
+              <w:lang w:eastAsia="de-CH"/>
+            </w:rPr>
+          </w:pPr>
+          <w:hyperlink w:anchor="_Toc237261058" w:history="1">
+            <w:r>
+              <w:rPr>
+                <w:rStyle w:val="Hyperlink"/>
+                <w:noProof/>
+              </w:rPr>
+              <w:t>6. Projektstruktur</w:t>
+            </w:r>
+            <w:r>
+              <w:rPr>
+                <w:noProof/>
+                <w:webHidden/>
+              </w:rPr>
+              <w:tab/>
+            </w:r>
+            <w:r>
+              <w:rPr>
+                <w:noProof/>
+                <w:webHidden/>
+              </w:rPr>
+              <w:fldChar w:fldCharType="begin"/>
+            </w:r>
+            <w:r>
+              <w:rPr>
+                <w:noProof/>
+                <w:webHidden/>
+              </w:rPr>
+              <w:instrText xml:space="preserve"> PAGEREF _Toc237261058 \h </w:instrText>
+            </w:r>
+            <w:r>
+              <w:rPr>
+                <w:noProof/>
+                <w:webHidden/>
+              </w:rPr>
+            </w:r>
+            <w:r>
+              <w:rPr>
+                <w:noProof/>
+                <w:webHidden/>
+              </w:rPr>
+              <w:fldChar w:fldCharType="separate"/>
+            </w:r>
+            <w:r>
+              <w:rPr>
+                <w:noProof/>
+                <w:webHidden/>
+              </w:rPr>
+              <w:t>10</w:t>
+            </w:r>
+            <w:r>
+              <w:rPr>
+                <w:noProof/>
+                <w:webHidden/>
+              </w:rPr>
+              <w:fldChar w:fldCharType="end"/>
+            </w:r>
+          </w:hyperlink>
+        </w:p>
+        <w:p>
+          <w:pPr>
+            <w:pStyle w:val="Verzeichnis1"/>
+            <w:tabs>
+              <w:tab w:val="right" w:leader="dot" w:pos="10456"/>
+            </w:tabs>
+            <w:rPr>
+              <w:rFonts w:eastAsiaTheme="minorEastAsia"/>
+              <w:noProof/>
+              <w:lang w:eastAsia="de-CH"/>
+            </w:rPr>
+          </w:pPr>
+          <w:hyperlink w:anchor="_Toc237261059" w:history="1">
+            <w:r>
+              <w:rPr>
+                <w:rStyle w:val="Hyperlink"/>
+                <w:noProof/>
+              </w:rPr>
+              <w:t>7. Umsetzung</w:t>
+            </w:r>
+            <w:r>
+              <w:rPr>
+                <w:noProof/>
+                <w:webHidden/>
+              </w:rPr>
+              <w:tab/>
+            </w:r>
+            <w:r>
+              <w:rPr>
+                <w:noProof/>
+                <w:webHidden/>
+              </w:rPr>
+              <w:fldChar w:fldCharType="begin"/>
+            </w:r>
+            <w:r>
+              <w:rPr>
+                <w:noProof/>
+                <w:webHidden/>
+              </w:rPr>
+              <w:instrText xml:space="preserve"> PAGEREF _Toc237261059 \h </w:instrText>
+            </w:r>
+            <w:r>
+              <w:rPr>
+                <w:noProof/>
+                <w:webHidden/>
+              </w:rPr>
+            </w:r>
+            <w:r>
+              <w:rPr>
+                <w:noProof/>
+                <w:webHidden/>
+              </w:rPr>
+              <w:fldChar w:fldCharType="separate"/>
+            </w:r>
+            <w:r>
+              <w:rPr>
+                <w:noProof/>
+                <w:webHidden/>
+              </w:rPr>
+              <w:t>11</w:t>
+            </w:r>
+            <w:r>
+              <w:rPr>
+                <w:noProof/>
+                <w:webHidden/>
+              </w:rPr>
+              <w:fldChar w:fldCharType="end"/>
+            </w:r>
+          </w:hyperlink>
+        </w:p>
+        <w:p>
+          <w:pPr>
+            <w:pStyle w:val="Verzeichnis1"/>
+            <w:tabs>
+              <w:tab w:val="right" w:leader="dot" w:pos="10456"/>
+            </w:tabs>
+            <w:rPr>
+              <w:rFonts w:eastAsiaTheme="minorEastAsia"/>
+              <w:noProof/>
+              <w:lang w:eastAsia="de-CH"/>
+            </w:rPr>
+          </w:pPr>
+          <w:hyperlink w:anchor="_Toc237261060" w:history="1">
+            <w:r>
+              <w:rPr>
+                <w:rStyle w:val="Hyperlink"/>
+                <w:noProof/>
+              </w:rPr>
+              <w:t>8. Unit-Tests</w:t>
+            </w:r>
+            <w:r>
+              <w:rPr>
+                <w:noProof/>
+                <w:webHidden/>
+              </w:rPr>
+              <w:tab/>
+            </w:r>
+            <w:r>
+              <w:rPr>
+                <w:noProof/>
+                <w:webHidden/>
+              </w:rPr>
+              <w:fldChar w:fldCharType="begin"/>
+            </w:r>
+            <w:r>
+              <w:rPr>
+                <w:noProof/>
+                <w:webHidden/>
+              </w:rPr>
+              <w:instrText xml:space="preserve"> PAGEREF _Toc237261060 \h </w:instrText>
+            </w:r>
+            <w:r>
+              <w:rPr>
+                <w:noProof/>
+                <w:webHidden/>
+              </w:rPr>
+            </w:r>
+            <w:r>
+              <w:rPr>
+                <w:noProof/>
+                <w:webHidden/>
+              </w:rPr>
+              <w:fldChar w:fldCharType="separate"/>
+            </w:r>
+            <w:r>
+              <w:rPr>
+                <w:noProof/>
+                <w:webHidden/>
+              </w:rPr>
+              <w:t>13</w:t>
+            </w:r>
+            <w:r>
+              <w:rPr>
+                <w:noProof/>
+                <w:webHidden/>
+              </w:rPr>
+              <w:fldChar w:fldCharType="end"/>
+            </w:r>
+          </w:hyperlink>
+        </w:p>
+        <w:p>
+          <w:pPr>
+            <w:pStyle w:val="Verzeichnis1"/>
+            <w:tabs>
+              <w:tab w:val="right" w:leader="dot" w:pos="10456"/>
+            </w:tabs>
+            <w:rPr>
+              <w:rFonts w:eastAsiaTheme="minorEastAsia"/>
+              <w:noProof/>
+              <w:lang w:eastAsia="de-CH"/>
+            </w:rPr>
+          </w:pPr>
+          <w:hyperlink w:anchor="_Toc237261061" w:history="1">
+            <w:r>
+              <w:rPr>
+                <w:rStyle w:val="Hyperlink"/>
+                <w:noProof/>
+              </w:rPr>
+              <w:t>9. Definition of Done</w:t>
+            </w:r>
+            <w:r>
+              <w:rPr>
+                <w:noProof/>
+                <w:webHidden/>
+              </w:rPr>
+              <w:tab/>
+            </w:r>
+            <w:r>
+              <w:rPr>
+                <w:noProof/>
+                <w:webHidden/>
+              </w:rPr>
+              <w:fldChar w:fldCharType="begin"/>
+            </w:r>
+            <w:r>
+              <w:rPr>
+                <w:noProof/>
+                <w:webHidden/>
+              </w:rPr>
+              <w:instrText xml:space="preserve"> PAGEREF _Toc237261061 \h </w:instrText>
+            </w:r>
+            <w:r>
+              <w:rPr>
+                <w:noProof/>
+                <w:webHidden/>
+              </w:rPr>
+            </w:r>
+            <w:r>
+              <w:rPr>
+                <w:noProof/>
+                <w:webHidden/>
+              </w:rPr>
+              <w:fldChar w:fldCharType="separate"/>
+            </w:r>
+            <w:r>
+              <w:rPr>
+                <w:noProof/>
+                <w:webHidden/>
+              </w:rPr>
+              <w:t>15</w:t>
+            </w:r>
+            <w:r>
+              <w:rPr>
+                <w:noProof/>
+                <w:webHidden/>
+              </w:rPr>
+              <w:fldChar w:fldCharType="end"/>
+            </w:r>
+          </w:hyperlink>
+        </w:p>
+        <w:p>
+          <w:pPr>
+            <w:pStyle w:val="Verzeichnis1"/>
+            <w:tabs>
+              <w:tab w:val="right" w:leader="dot" w:pos="10456"/>
+            </w:tabs>
+            <w:rPr>
+              <w:rFonts w:eastAsiaTheme="minorEastAsia"/>
+              <w:noProof/>
+              <w:lang w:eastAsia="de-CH"/>
+            </w:rPr>
+          </w:pPr>
+          <w:hyperlink w:anchor="_Toc237261062" w:history="1">
+            <w:r>
+              <w:rPr>
+                <w:rStyle w:val="Hyperlink"/>
+                <w:noProof/>
+              </w:rPr>
+              <w:t>10. Fazit</w:t>
+            </w:r>
+            <w:r>
+              <w:rPr>
+                <w:noProof/>
+                <w:webHidden/>
+              </w:rPr>
+              <w:tab/>
+            </w:r>
+            <w:r>
+              <w:rPr>
+                <w:noProof/>
+                <w:webHidden/>
+              </w:rPr>
+              <w:fldChar w:fldCharType="begin"/>
+            </w:r>
+            <w:r>
+              <w:rPr>
+                <w:noProof/>
+                <w:webHidden/>
+              </w:rPr>
+              <w:instrText xml:space="preserve"> PAGEREF _Toc237261062 \h </w:instrText>
+            </w:r>
+            <w:r>
+              <w:rPr>
+                <w:noProof/>
+                <w:webHidden/>
+              </w:rPr>
+            </w:r>
+            <w:r>
+              <w:rPr>
+                <w:noProof/>
+                <w:webHidden/>
+              </w:rPr>
+              <w:fldChar w:fldCharType="separate"/>
+            </w:r>
+            <w:r>
+              <w:rPr>
+                <w:noProof/>
+                <w:webHidden/>
+              </w:rPr>
+              <w:t>16</w:t>
+            </w:r>
+            <w:r>
+              <w:rPr>
+                <w:noProof/>
+                <w:webHidden/>
+              </w:rPr>
+              <w:fldChar w:fldCharType="end"/>
+            </w:r>
+          </w:hyperlink>
+        </w:p>
+        <w:p>
           <w:r>
             <w:rPr>
               <w:b/>
@@ -541,8 +1037,6 @@
         <w:br w:type="page"/>
       </w:r>
     </w:p>
-    <w:p/>
-    <w:p/>
     <w:p>
       <w:pPr>
         <w:tabs>
@@ -552,17 +1046,18 @@
         <w:rPr>
           <w:b/>
           <w:bCs/>
-          <w:sz w:val="28"/>
-          <w:szCs w:val="28"/>
-        </w:rPr>
-      </w:pPr>
-      <w:r>
-        <w:rPr>
-          <w:b/>
-          <w:bCs/>
-          <w:sz w:val="28"/>
-          <w:szCs w:val="28"/>
-        </w:rPr>
+          <w:sz w:val="36"/>
+          <w:szCs w:val="36"/>
+        </w:rPr>
+      </w:pPr>
+      <w:r>
+        <w:rPr>
+          <w:b/>
+          <w:bCs/>
+          <w:sz w:val="36"/>
+          <w:szCs w:val="36"/>
+        </w:rPr>
+        <w:lastRenderedPageBreak/>
         <w:t>Dokumentation Schulverwaltungsanwendung</w:t>
       </w:r>
     </w:p>
@@ -573,7 +1068,7 @@
       <w:r>
         <w:t xml:space="preserve"> </w:t>
       </w:r>
-      <w:bookmarkStart w:id="0" w:name="_Toc236923653"/>
+      <w:bookmarkStart w:id="0" w:name="_Toc237261053"/>
       <w:r>
         <w:t>1. Ausgangslage</w:t>
       </w:r>
@@ -721,7 +1216,7 @@
       <w:r>
         <w:t xml:space="preserve"> </w:t>
       </w:r>
-      <w:bookmarkStart w:id="1" w:name="_Toc236923654"/>
+      <w:bookmarkStart w:id="1" w:name="_Toc237261054"/>
       <w:r>
         <w:t>2. Ziel</w:t>
       </w:r>
@@ -869,7 +1364,7 @@
       <w:pPr>
         <w:pStyle w:val="berschrift1"/>
       </w:pPr>
-      <w:bookmarkStart w:id="2" w:name="_Toc236923655"/>
+      <w:bookmarkStart w:id="2" w:name="_Toc237261055"/>
       <w:r>
         <w:lastRenderedPageBreak/>
         <w:t>3. User Stories</w:t>
@@ -1512,7 +2007,15 @@
         </w:tabs>
       </w:pPr>
       <w:r>
-        <w:t>(NEU) Es wird nach ID Sortiert.</w:t>
+        <w:t xml:space="preserve">(NEU) Es wird nach </w:t>
+      </w:r>
+      <w:proofErr w:type="gramStart"/>
+      <w:r>
+        <w:t>ID Sortiert</w:t>
+      </w:r>
+      <w:proofErr w:type="gramEnd"/>
+      <w:r>
+        <w:t>.</w:t>
       </w:r>
     </w:p>
     <w:p>
@@ -1717,7 +2220,15 @@
         </w:tabs>
       </w:pPr>
       <w:r>
-        <w:t>(NEU) Es wird nach ID Sortiert.</w:t>
+        <w:t xml:space="preserve">(NEU) Es wird nach </w:t>
+      </w:r>
+      <w:proofErr w:type="gramStart"/>
+      <w:r>
+        <w:t>ID Sortiert</w:t>
+      </w:r>
+      <w:proofErr w:type="gramEnd"/>
+      <w:r>
+        <w:t>.</w:t>
       </w:r>
     </w:p>
     <w:p>
@@ -1890,7 +2401,15 @@
         </w:tabs>
       </w:pPr>
       <w:r>
-        <w:t>(NEU) Es wird nach ID Sortiert.</w:t>
+        <w:t xml:space="preserve">(NEU) Es wird nach </w:t>
+      </w:r>
+      <w:proofErr w:type="gramStart"/>
+      <w:r>
+        <w:t>ID Sortiert</w:t>
+      </w:r>
+      <w:proofErr w:type="gramEnd"/>
+      <w:r>
+        <w:t>.</w:t>
       </w:r>
     </w:p>
     <w:p>
@@ -2319,10 +2838,12 @@
           <w:szCs w:val="28"/>
         </w:rPr>
       </w:pPr>
+      <w:bookmarkStart w:id="3" w:name="_Toc237261056"/>
       <w:r>
         <w:lastRenderedPageBreak/>
-        <w:t xml:space="preserve"> 4. Geplante Daten</w:t>
-      </w:r>
+        <w:t>4. Geplante Daten</w:t>
+      </w:r>
+      <w:bookmarkEnd w:id="3"/>
     </w:p>
     <w:p>
       <w:pPr>
@@ -2617,12 +3138,14 @@
       <w:r>
         <w:t xml:space="preserve">(NEU) </w:t>
       </w:r>
+      <w:proofErr w:type="gramStart"/>
       <w:r>
         <w:t>E</w:t>
       </w:r>
       <w:r>
         <w:t>mail</w:t>
       </w:r>
+      <w:proofErr w:type="gramEnd"/>
     </w:p>
     <w:p>
       <w:pPr>
@@ -2825,9 +3348,11 @@
           <w:tab w:val="left" w:pos="2835"/>
         </w:tabs>
       </w:pPr>
+      <w:proofErr w:type="spellStart"/>
       <w:r>
         <w:t>Kursname</w:t>
       </w:r>
+      <w:proofErr w:type="spellEnd"/>
     </w:p>
     <w:p>
       <w:pPr>
@@ -3027,10 +3552,12 @@
       <w:pPr>
         <w:pStyle w:val="berschrift1"/>
       </w:pPr>
+      <w:bookmarkStart w:id="4" w:name="_Toc237261057"/>
       <w:r>
         <w:lastRenderedPageBreak/>
-        <w:t xml:space="preserve"> 5. Benutzeroberfläche</w:t>
-      </w:r>
+        <w:t>5. Benutzeroberfläche</w:t>
+      </w:r>
+      <w:bookmarkEnd w:id="4"/>
     </w:p>
     <w:p>
       <w:pPr>
@@ -3113,6 +3640,7 @@
           <w:bCs/>
         </w:rPr>
       </w:pPr>
+      <w:proofErr w:type="spellStart"/>
       <w:r>
         <w:rPr>
           <w:b/>
@@ -3120,6 +3648,7 @@
         </w:rPr>
         <w:t>ComboBox</w:t>
       </w:r>
+      <w:proofErr w:type="spellEnd"/>
     </w:p>
     <w:p>
       <w:pPr>
@@ -3159,6 +3688,7 @@
           <w:bCs/>
         </w:rPr>
       </w:pPr>
+      <w:proofErr w:type="spellStart"/>
       <w:r>
         <w:rPr>
           <w:b/>
@@ -3166,6 +3696,7 @@
         </w:rPr>
         <w:t>DataGridView</w:t>
       </w:r>
+      <w:proofErr w:type="spellEnd"/>
     </w:p>
     <w:p>
       <w:pPr>
@@ -3340,10 +3871,12 @@
       <w:pPr>
         <w:pStyle w:val="berschrift1"/>
       </w:pPr>
+      <w:bookmarkStart w:id="5" w:name="_Toc237261058"/>
       <w:r>
         <w:lastRenderedPageBreak/>
-        <w:t xml:space="preserve"> 6. Projektstruktur</w:t>
-      </w:r>
+        <w:t>6. Projektstruktur</w:t>
+      </w:r>
+      <w:bookmarkEnd w:id="5"/>
     </w:p>
     <w:p>
       <w:pPr>
@@ -3388,12 +3921,14 @@
           <w:rFonts w:ascii="Consolas" w:hAnsi="Consolas"/>
         </w:rPr>
       </w:pPr>
+      <w:proofErr w:type="spellStart"/>
       <w:r>
         <w:rPr>
           <w:rFonts w:ascii="Consolas" w:hAnsi="Consolas"/>
         </w:rPr>
         <w:t>SchulApp</w:t>
       </w:r>
+      <w:proofErr w:type="spellEnd"/>
     </w:p>
     <w:p>
       <w:pPr>
@@ -3470,22 +4005,30 @@
         <w:rPr>
           <w:rFonts w:ascii="Consolas" w:hAnsi="Consolas"/>
         </w:rPr>
-        <w:t xml:space="preserve"> Schueler.cs</w:t>
-      </w:r>
-    </w:p>
-    <w:p>
-      <w:pPr>
-        <w:tabs>
-          <w:tab w:val="left" w:pos="2835"/>
-        </w:tabs>
+        <w:t xml:space="preserve"> </w:t>
+      </w:r>
+      <w:proofErr w:type="spellStart"/>
+      <w:r>
         <w:rPr>
           <w:rFonts w:ascii="Consolas" w:hAnsi="Consolas"/>
         </w:rPr>
-      </w:pPr>
-      <w:r>
+        <w:t>Schueler.cs</w:t>
+      </w:r>
+      <w:proofErr w:type="spellEnd"/>
+    </w:p>
+    <w:p>
+      <w:pPr>
+        <w:tabs>
+          <w:tab w:val="left" w:pos="2835"/>
+        </w:tabs>
         <w:rPr>
           <w:rFonts w:ascii="Consolas" w:hAnsi="Consolas"/>
         </w:rPr>
+      </w:pPr>
+      <w:r>
+        <w:rPr>
+          <w:rFonts w:ascii="Consolas" w:hAnsi="Consolas"/>
+        </w:rPr>
         <w:t xml:space="preserve">│   </w:t>
       </w:r>
       <w:r>
@@ -3504,22 +4047,30 @@
         <w:rPr>
           <w:rFonts w:ascii="Consolas" w:hAnsi="Consolas"/>
         </w:rPr>
-        <w:t xml:space="preserve"> Lehrer.cs</w:t>
-      </w:r>
-    </w:p>
-    <w:p>
-      <w:pPr>
-        <w:tabs>
-          <w:tab w:val="left" w:pos="2835"/>
-        </w:tabs>
+        <w:t xml:space="preserve"> </w:t>
+      </w:r>
+      <w:proofErr w:type="spellStart"/>
+      <w:r>
         <w:rPr>
           <w:rFonts w:ascii="Consolas" w:hAnsi="Consolas"/>
         </w:rPr>
-      </w:pPr>
-      <w:r>
+        <w:t>Lehrer.cs</w:t>
+      </w:r>
+      <w:proofErr w:type="spellEnd"/>
+    </w:p>
+    <w:p>
+      <w:pPr>
+        <w:tabs>
+          <w:tab w:val="left" w:pos="2835"/>
+        </w:tabs>
         <w:rPr>
           <w:rFonts w:ascii="Consolas" w:hAnsi="Consolas"/>
         </w:rPr>
+      </w:pPr>
+      <w:r>
+        <w:rPr>
+          <w:rFonts w:ascii="Consolas" w:hAnsi="Consolas"/>
+        </w:rPr>
         <w:t xml:space="preserve">│   </w:t>
       </w:r>
       <w:r>
@@ -3538,22 +4089,30 @@
         <w:rPr>
           <w:rFonts w:ascii="Consolas" w:hAnsi="Consolas"/>
         </w:rPr>
-        <w:t xml:space="preserve"> Klasse.cs</w:t>
-      </w:r>
-    </w:p>
-    <w:p>
-      <w:pPr>
-        <w:tabs>
-          <w:tab w:val="left" w:pos="2835"/>
-        </w:tabs>
+        <w:t xml:space="preserve"> </w:t>
+      </w:r>
+      <w:proofErr w:type="spellStart"/>
+      <w:r>
         <w:rPr>
           <w:rFonts w:ascii="Consolas" w:hAnsi="Consolas"/>
         </w:rPr>
-      </w:pPr>
-      <w:r>
+        <w:t>Klasse.cs</w:t>
+      </w:r>
+      <w:proofErr w:type="spellEnd"/>
+    </w:p>
+    <w:p>
+      <w:pPr>
+        <w:tabs>
+          <w:tab w:val="left" w:pos="2835"/>
+        </w:tabs>
         <w:rPr>
           <w:rFonts w:ascii="Consolas" w:hAnsi="Consolas"/>
         </w:rPr>
+      </w:pPr>
+      <w:r>
+        <w:rPr>
+          <w:rFonts w:ascii="Consolas" w:hAnsi="Consolas"/>
+        </w:rPr>
         <w:t xml:space="preserve">│   </w:t>
       </w:r>
       <w:r>
@@ -3572,38 +4131,54 @@
         <w:rPr>
           <w:rFonts w:ascii="Consolas" w:hAnsi="Consolas"/>
         </w:rPr>
-        <w:t xml:space="preserve"> Kurs.cs</w:t>
-      </w:r>
-    </w:p>
-    <w:p>
-      <w:pPr>
-        <w:tabs>
-          <w:tab w:val="left" w:pos="2835"/>
-        </w:tabs>
+        <w:t xml:space="preserve"> </w:t>
+      </w:r>
+      <w:proofErr w:type="spellStart"/>
+      <w:r>
         <w:rPr>
           <w:rFonts w:ascii="Consolas" w:hAnsi="Consolas"/>
         </w:rPr>
-      </w:pPr>
-      <w:r>
+        <w:t>Kurs.cs</w:t>
+      </w:r>
+      <w:proofErr w:type="spellEnd"/>
+    </w:p>
+    <w:p>
+      <w:pPr>
+        <w:tabs>
+          <w:tab w:val="left" w:pos="2835"/>
+        </w:tabs>
         <w:rPr>
           <w:rFonts w:ascii="Consolas" w:hAnsi="Consolas"/>
         </w:rPr>
-        <w:t>│   └── StundenplanEintrag.cs</w:t>
-      </w:r>
-    </w:p>
-    <w:p>
-      <w:pPr>
-        <w:tabs>
-          <w:tab w:val="left" w:pos="2835"/>
-        </w:tabs>
+      </w:pPr>
+      <w:r>
         <w:rPr>
           <w:rFonts w:ascii="Consolas" w:hAnsi="Consolas"/>
         </w:rPr>
-      </w:pPr>
+        <w:t xml:space="preserve">│   └── </w:t>
+      </w:r>
+      <w:proofErr w:type="spellStart"/>
       <w:r>
         <w:rPr>
           <w:rFonts w:ascii="Consolas" w:hAnsi="Consolas"/>
         </w:rPr>
+        <w:t>StundenplanEintrag.cs</w:t>
+      </w:r>
+      <w:proofErr w:type="spellEnd"/>
+    </w:p>
+    <w:p>
+      <w:pPr>
+        <w:tabs>
+          <w:tab w:val="left" w:pos="2835"/>
+        </w:tabs>
+        <w:rPr>
+          <w:rFonts w:ascii="Consolas" w:hAnsi="Consolas"/>
+        </w:rPr>
+      </w:pPr>
+      <w:r>
+        <w:rPr>
+          <w:rFonts w:ascii="Consolas" w:hAnsi="Consolas"/>
+        </w:rPr>
         <w:t>│</w:t>
       </w:r>
     </w:p>
@@ -3648,22 +4223,30 @@
         <w:rPr>
           <w:rFonts w:ascii="Consolas" w:hAnsi="Consolas"/>
         </w:rPr>
-        <w:t>│   └── SchulService.cs</w:t>
-      </w:r>
-    </w:p>
-    <w:p>
-      <w:pPr>
-        <w:tabs>
-          <w:tab w:val="left" w:pos="2835"/>
-        </w:tabs>
+        <w:t xml:space="preserve">│   └── </w:t>
+      </w:r>
+      <w:proofErr w:type="spellStart"/>
+      <w:r>
         <w:rPr>
           <w:rFonts w:ascii="Consolas" w:hAnsi="Consolas"/>
         </w:rPr>
-      </w:pPr>
-      <w:r>
+        <w:t>SchulService.cs</w:t>
+      </w:r>
+      <w:proofErr w:type="spellEnd"/>
+    </w:p>
+    <w:p>
+      <w:pPr>
+        <w:tabs>
+          <w:tab w:val="left" w:pos="2835"/>
+        </w:tabs>
         <w:rPr>
           <w:rFonts w:ascii="Consolas" w:hAnsi="Consolas"/>
         </w:rPr>
+      </w:pPr>
+      <w:r>
+        <w:rPr>
+          <w:rFonts w:ascii="Consolas" w:hAnsi="Consolas"/>
+        </w:rPr>
         <w:t>│</w:t>
       </w:r>
     </w:p>
@@ -3756,8 +4339,16 @@
         <w:rPr>
           <w:rFonts w:ascii="Consolas" w:hAnsi="Consolas"/>
         </w:rPr>
-        <w:t xml:space="preserve">    └── SchulServiceTests.cs</w:t>
-      </w:r>
+        <w:t xml:space="preserve">    └── </w:t>
+      </w:r>
+      <w:proofErr w:type="spellStart"/>
+      <w:r>
+        <w:rPr>
+          <w:rFonts w:ascii="Consolas" w:hAnsi="Consolas"/>
+        </w:rPr>
+        <w:t>SchulServiceTests.cs</w:t>
+      </w:r>
+      <w:proofErr w:type="spellEnd"/>
     </w:p>
     <w:p>
       <w:pPr>
@@ -3835,10 +4426,12 @@
       <w:pPr>
         <w:pStyle w:val="berschrift1"/>
       </w:pPr>
+      <w:bookmarkStart w:id="6" w:name="_Toc237261059"/>
       <w:r>
         <w:lastRenderedPageBreak/>
-        <w:t xml:space="preserve"> 7. Umsetzung</w:t>
-      </w:r>
+        <w:t>7. Umsetzung</w:t>
+      </w:r>
+      <w:bookmarkEnd w:id="6"/>
     </w:p>
     <w:p>
       <w:pPr>
@@ -4111,6 +4704,7 @@
           <w:iCs/>
         </w:rPr>
       </w:pPr>
+      <w:proofErr w:type="spellStart"/>
       <w:r>
         <w:rPr>
           <w:b/>
@@ -4118,8 +4712,49 @@
           <w:i/>
           <w:iCs/>
         </w:rPr>
-        <w:t>public class Schueler</w:t>
-      </w:r>
+        <w:t>public</w:t>
+      </w:r>
+      <w:proofErr w:type="spellEnd"/>
+      <w:r>
+        <w:rPr>
+          <w:b/>
+          <w:bCs/>
+          <w:i/>
+          <w:iCs/>
+        </w:rPr>
+        <w:t xml:space="preserve"> </w:t>
+      </w:r>
+      <w:proofErr w:type="spellStart"/>
+      <w:r>
+        <w:rPr>
+          <w:b/>
+          <w:bCs/>
+          <w:i/>
+          <w:iCs/>
+        </w:rPr>
+        <w:t>class</w:t>
+      </w:r>
+      <w:proofErr w:type="spellEnd"/>
+      <w:r>
+        <w:rPr>
+          <w:b/>
+          <w:bCs/>
+          <w:i/>
+          <w:iCs/>
+        </w:rPr>
+        <w:t xml:space="preserve"> </w:t>
+      </w:r>
+      <w:proofErr w:type="spellStart"/>
+      <w:r>
+        <w:rPr>
+          <w:b/>
+          <w:bCs/>
+          <w:i/>
+          <w:iCs/>
+        </w:rPr>
+        <w:t>Schueler</w:t>
+      </w:r>
+      <w:proofErr w:type="spellEnd"/>
     </w:p>
     <w:p>
       <w:pPr>
@@ -4166,14 +4801,10 @@
           <w:iCs/>
           <w:lang w:val="en-US"/>
         </w:rPr>
-        <w:t xml:space="preserve">    public int Id { get; set; }</w:t>
-      </w:r>
-    </w:p>
-    <w:p>
-      <w:pPr>
-        <w:tabs>
-          <w:tab w:val="left" w:pos="2835"/>
-        </w:tabs>
+        <w:t xml:space="preserve">    public int Id </w:t>
+      </w:r>
+      <w:proofErr w:type="gramStart"/>
+      <w:r>
         <w:rPr>
           <w:b/>
           <w:bCs/>
@@ -4181,7 +4812,9 @@
           <w:iCs/>
           <w:lang w:val="en-US"/>
         </w:rPr>
-      </w:pPr>
+        <w:t>{ get</w:t>
+      </w:r>
+      <w:proofErr w:type="gramEnd"/>
       <w:r>
         <w:rPr>
           <w:b/>
@@ -4190,14 +4823,10 @@
           <w:iCs/>
           <w:lang w:val="en-US"/>
         </w:rPr>
-        <w:t xml:space="preserve">    public string Vorname { get; set; }</w:t>
-      </w:r>
-    </w:p>
-    <w:p>
-      <w:pPr>
-        <w:tabs>
-          <w:tab w:val="left" w:pos="2835"/>
-        </w:tabs>
+        <w:t>; set</w:t>
+      </w:r>
+      <w:proofErr w:type="gramStart"/>
+      <w:r>
         <w:rPr>
           <w:b/>
           <w:bCs/>
@@ -4205,8 +4834,15 @@
           <w:iCs/>
           <w:lang w:val="en-US"/>
         </w:rPr>
-      </w:pPr>
-      <w:r>
+        <w:t>; }</w:t>
+      </w:r>
+      <w:proofErr w:type="gramEnd"/>
+    </w:p>
+    <w:p>
+      <w:pPr>
+        <w:tabs>
+          <w:tab w:val="left" w:pos="2835"/>
+        </w:tabs>
         <w:rPr>
           <w:b/>
           <w:bCs/>
@@ -4214,14 +4850,8 @@
           <w:iCs/>
           <w:lang w:val="en-US"/>
         </w:rPr>
-        <w:t xml:space="preserve">    public string Nachname { get; set; }</w:t>
-      </w:r>
-    </w:p>
-    <w:p>
-      <w:pPr>
-        <w:tabs>
-          <w:tab w:val="left" w:pos="2835"/>
-        </w:tabs>
+      </w:pPr>
+      <w:r>
         <w:rPr>
           <w:b/>
           <w:bCs/>
@@ -4229,7 +4859,9 @@
           <w:iCs/>
           <w:lang w:val="en-US"/>
         </w:rPr>
-      </w:pPr>
+        <w:t xml:space="preserve">    public string </w:t>
+      </w:r>
+      <w:proofErr w:type="spellStart"/>
       <w:r>
         <w:rPr>
           <w:b/>
@@ -4238,8 +4870,191 @@
           <w:iCs/>
           <w:lang w:val="en-US"/>
         </w:rPr>
-        <w:t xml:space="preserve">    public string Klasse { get; set; }</w:t>
-      </w:r>
+        <w:t>Vorname</w:t>
+      </w:r>
+      <w:proofErr w:type="spellEnd"/>
+      <w:r>
+        <w:rPr>
+          <w:b/>
+          <w:bCs/>
+          <w:i/>
+          <w:iCs/>
+          <w:lang w:val="en-US"/>
+        </w:rPr>
+        <w:t xml:space="preserve"> </w:t>
+      </w:r>
+      <w:proofErr w:type="gramStart"/>
+      <w:r>
+        <w:rPr>
+          <w:b/>
+          <w:bCs/>
+          <w:i/>
+          <w:iCs/>
+          <w:lang w:val="en-US"/>
+        </w:rPr>
+        <w:t>{ get</w:t>
+      </w:r>
+      <w:proofErr w:type="gramEnd"/>
+      <w:r>
+        <w:rPr>
+          <w:b/>
+          <w:bCs/>
+          <w:i/>
+          <w:iCs/>
+          <w:lang w:val="en-US"/>
+        </w:rPr>
+        <w:t>; set</w:t>
+      </w:r>
+      <w:proofErr w:type="gramStart"/>
+      <w:r>
+        <w:rPr>
+          <w:b/>
+          <w:bCs/>
+          <w:i/>
+          <w:iCs/>
+          <w:lang w:val="en-US"/>
+        </w:rPr>
+        <w:t>; }</w:t>
+      </w:r>
+      <w:proofErr w:type="gramEnd"/>
+    </w:p>
+    <w:p>
+      <w:pPr>
+        <w:tabs>
+          <w:tab w:val="left" w:pos="2835"/>
+        </w:tabs>
+        <w:rPr>
+          <w:b/>
+          <w:bCs/>
+          <w:i/>
+          <w:iCs/>
+          <w:lang w:val="en-US"/>
+        </w:rPr>
+      </w:pPr>
+      <w:r>
+        <w:rPr>
+          <w:b/>
+          <w:bCs/>
+          <w:i/>
+          <w:iCs/>
+          <w:lang w:val="en-US"/>
+        </w:rPr>
+        <w:t xml:space="preserve">    public string </w:t>
+      </w:r>
+      <w:proofErr w:type="spellStart"/>
+      <w:r>
+        <w:rPr>
+          <w:b/>
+          <w:bCs/>
+          <w:i/>
+          <w:iCs/>
+          <w:lang w:val="en-US"/>
+        </w:rPr>
+        <w:t>Nachname</w:t>
+      </w:r>
+      <w:proofErr w:type="spellEnd"/>
+      <w:r>
+        <w:rPr>
+          <w:b/>
+          <w:bCs/>
+          <w:i/>
+          <w:iCs/>
+          <w:lang w:val="en-US"/>
+        </w:rPr>
+        <w:t xml:space="preserve"> </w:t>
+      </w:r>
+      <w:proofErr w:type="gramStart"/>
+      <w:r>
+        <w:rPr>
+          <w:b/>
+          <w:bCs/>
+          <w:i/>
+          <w:iCs/>
+          <w:lang w:val="en-US"/>
+        </w:rPr>
+        <w:t>{ get</w:t>
+      </w:r>
+      <w:proofErr w:type="gramEnd"/>
+      <w:r>
+        <w:rPr>
+          <w:b/>
+          <w:bCs/>
+          <w:i/>
+          <w:iCs/>
+          <w:lang w:val="en-US"/>
+        </w:rPr>
+        <w:t>; set</w:t>
+      </w:r>
+      <w:proofErr w:type="gramStart"/>
+      <w:r>
+        <w:rPr>
+          <w:b/>
+          <w:bCs/>
+          <w:i/>
+          <w:iCs/>
+          <w:lang w:val="en-US"/>
+        </w:rPr>
+        <w:t>; }</w:t>
+      </w:r>
+      <w:proofErr w:type="gramEnd"/>
+    </w:p>
+    <w:p>
+      <w:pPr>
+        <w:tabs>
+          <w:tab w:val="left" w:pos="2835"/>
+        </w:tabs>
+        <w:rPr>
+          <w:b/>
+          <w:bCs/>
+          <w:i/>
+          <w:iCs/>
+          <w:lang w:val="en-US"/>
+        </w:rPr>
+      </w:pPr>
+      <w:r>
+        <w:rPr>
+          <w:b/>
+          <w:bCs/>
+          <w:i/>
+          <w:iCs/>
+          <w:lang w:val="en-US"/>
+        </w:rPr>
+        <w:t xml:space="preserve">    public string Klasse </w:t>
+      </w:r>
+      <w:proofErr w:type="gramStart"/>
+      <w:r>
+        <w:rPr>
+          <w:b/>
+          <w:bCs/>
+          <w:i/>
+          <w:iCs/>
+          <w:lang w:val="en-US"/>
+        </w:rPr>
+        <w:t>{ get</w:t>
+      </w:r>
+      <w:proofErr w:type="gramEnd"/>
+      <w:r>
+        <w:rPr>
+          <w:b/>
+          <w:bCs/>
+          <w:i/>
+          <w:iCs/>
+          <w:lang w:val="en-US"/>
+        </w:rPr>
+        <w:t>; set</w:t>
+      </w:r>
+      <w:proofErr w:type="gramStart"/>
+      <w:r>
+        <w:rPr>
+          <w:b/>
+          <w:bCs/>
+          <w:i/>
+          <w:iCs/>
+          <w:lang w:val="en-US"/>
+        </w:rPr>
+        <w:t>; }</w:t>
+      </w:r>
+      <w:proofErr w:type="gramEnd"/>
     </w:p>
     <w:p>
       <w:pPr>
@@ -4663,10 +5478,12 @@
       <w:pPr>
         <w:pStyle w:val="berschrift1"/>
       </w:pPr>
+      <w:bookmarkStart w:id="7" w:name="_Toc237261060"/>
       <w:r>
         <w:lastRenderedPageBreak/>
-        <w:t xml:space="preserve"> 8. Unit-Tests</w:t>
-      </w:r>
+        <w:t>8. Unit-Tests</w:t>
+      </w:r>
+      <w:bookmarkEnd w:id="7"/>
     </w:p>
     <w:p>
       <w:pPr>
@@ -5317,15 +6134,14 @@
         <w:rPr>
           <w:color w:val="FF0000"/>
         </w:rPr>
-        <w:t>Der Schüler befindet sich nicht mehr in der Liste.</w:t>
-      </w:r>
-    </w:p>
-    <w:p>
-      <w:pPr>
-        <w:tabs>
-          <w:tab w:val="left" w:pos="2835"/>
-        </w:tabs>
-      </w:pPr>
+        <w:t>Der Schüler befindet sich nicht mehr in der Liste</w:t>
+      </w:r>
+      <w:r>
+        <w:rPr>
+          <w:color w:val="FF0000"/>
+        </w:rPr>
+        <w:t>.</w:t>
+      </w:r>
     </w:p>
     <w:p>
       <w:pPr>
@@ -5345,9 +6161,19 @@
       <w:pPr>
         <w:pStyle w:val="berschrift1"/>
       </w:pPr>
-      <w:r>
-        <w:t xml:space="preserve"> 9. Definition of Done</w:t>
-      </w:r>
+      <w:bookmarkStart w:id="8" w:name="_Toc237261061"/>
+      <w:r>
+        <w:t xml:space="preserve">9. Definition </w:t>
+      </w:r>
+      <w:proofErr w:type="spellStart"/>
+      <w:r>
+        <w:t>of</w:t>
+      </w:r>
+      <w:proofErr w:type="spellEnd"/>
+      <w:r>
+        <w:t xml:space="preserve"> Done</w:t>
+      </w:r>
+      <w:bookmarkEnd w:id="8"/>
     </w:p>
     <w:p>
       <w:pPr>
@@ -5629,10 +6455,15 @@
       <w:pPr>
         <w:pStyle w:val="berschrift1"/>
       </w:pPr>
+      <w:bookmarkStart w:id="9" w:name="_Toc237261062"/>
       <w:r>
         <w:lastRenderedPageBreak/>
-        <w:t xml:space="preserve"> 10. Fazit</w:t>
-      </w:r>
+        <w:t>10</w:t>
+      </w:r>
+      <w:r>
+        <w:t>. Fazit</w:t>
+      </w:r>
+      <w:bookmarkEnd w:id="9"/>
     </w:p>
     <w:p>
       <w:pPr>
@@ -5689,6 +6520,811 @@
       </w:pPr>
       <w:r>
         <w:t>Durch die Trennung zwischen Benutzeroberfläche, Datenmodellen und Programmlogik bleibt das Projekt übersichtlich. Die Unit-Tests stellen zusätzlich sicher, dass wichtige Funktionen wie das Erstellen, Bearbeiten und Löschen von Daten korrekt funktionieren.</w:t>
+      </w:r>
+    </w:p>
+    <w:p>
+      <w:r>
+        <w:br w:type="page"/>
+      </w:r>
+    </w:p>
+    <w:p>
+      <w:pPr>
+        <w:pStyle w:val="berschrift1"/>
+      </w:pPr>
+      <w:r>
+        <w:lastRenderedPageBreak/>
+        <w:t>11. Screenshots</w:t>
+      </w:r>
+    </w:p>
+    <w:p>
+      <w:r>
+        <w:rPr>
+          <w:noProof/>
+        </w:rPr>
+        <w:drawing>
+          <wp:inline distT="0" distB="0" distL="0" distR="0" wp14:anchorId="66CAF78D" wp14:editId="391F7A6D">
+            <wp:extent cx="2943225" cy="1416655"/>
+            <wp:effectExtent l="0" t="0" r="0" b="0"/>
+            <wp:docPr id="1125517738" name="Grafik 1"/>
+            <wp:cNvGraphicFramePr>
+              <a:graphicFrameLocks xmlns:a="http://schemas.openxmlformats.org/drawingml/2006/main" noChangeAspect="1"/>
+            </wp:cNvGraphicFramePr>
+            <a:graphic xmlns:a="http://schemas.openxmlformats.org/drawingml/2006/main">
+              <a:graphicData uri="http://schemas.openxmlformats.org/drawingml/2006/picture">
+                <pic:pic xmlns:pic="http://schemas.openxmlformats.org/drawingml/2006/picture">
+                  <pic:nvPicPr>
+                    <pic:cNvPr id="1125517738" name="Grafik 1125517738"/>
+                    <pic:cNvPicPr/>
+                  </pic:nvPicPr>
+                  <pic:blipFill>
+                    <a:blip r:embed="rId6">
+                      <a:extLst>
+                        <a:ext uri="{28A0092B-C50C-407E-A947-70E740481C1C}">
+                          <a14:useLocalDpi xmlns:a14="http://schemas.microsoft.com/office/drawing/2010/main" val="0"/>
+                        </a:ext>
+                      </a:extLst>
+                    </a:blip>
+                    <a:stretch>
+                      <a:fillRect/>
+                    </a:stretch>
+                  </pic:blipFill>
+                  <pic:spPr>
+                    <a:xfrm>
+                      <a:off x="0" y="0"/>
+                      <a:ext cx="2958514" cy="1424014"/>
+                    </a:xfrm>
+                    <a:prstGeom prst="rect">
+                      <a:avLst/>
+                    </a:prstGeom>
+                  </pic:spPr>
+                </pic:pic>
+              </a:graphicData>
+            </a:graphic>
+          </wp:inline>
+        </w:drawing>
+      </w:r>
+      <w:r>
+        <w:rPr>
+          <w:noProof/>
+        </w:rPr>
+        <w:drawing>
+          <wp:inline distT="0" distB="0" distL="0" distR="0" wp14:anchorId="68CB9789" wp14:editId="1B9FF67A">
+            <wp:extent cx="6645910" cy="3980815"/>
+            <wp:effectExtent l="0" t="0" r="2540" b="635"/>
+            <wp:docPr id="471888818" name="Grafik 2"/>
+            <wp:cNvGraphicFramePr>
+              <a:graphicFrameLocks xmlns:a="http://schemas.openxmlformats.org/drawingml/2006/main" noChangeAspect="1"/>
+            </wp:cNvGraphicFramePr>
+            <a:graphic xmlns:a="http://schemas.openxmlformats.org/drawingml/2006/main">
+              <a:graphicData uri="http://schemas.openxmlformats.org/drawingml/2006/picture">
+                <pic:pic xmlns:pic="http://schemas.openxmlformats.org/drawingml/2006/picture">
+                  <pic:nvPicPr>
+                    <pic:cNvPr id="471888818" name="Grafik 471888818"/>
+                    <pic:cNvPicPr/>
+                  </pic:nvPicPr>
+                  <pic:blipFill>
+                    <a:blip r:embed="rId7">
+                      <a:extLst>
+                        <a:ext uri="{28A0092B-C50C-407E-A947-70E740481C1C}">
+                          <a14:useLocalDpi xmlns:a14="http://schemas.microsoft.com/office/drawing/2010/main" val="0"/>
+                        </a:ext>
+                      </a:extLst>
+                    </a:blip>
+                    <a:stretch>
+                      <a:fillRect/>
+                    </a:stretch>
+                  </pic:blipFill>
+                  <pic:spPr>
+                    <a:xfrm>
+                      <a:off x="0" y="0"/>
+                      <a:ext cx="6645910" cy="3980815"/>
+                    </a:xfrm>
+                    <a:prstGeom prst="rect">
+                      <a:avLst/>
+                    </a:prstGeom>
+                  </pic:spPr>
+                </pic:pic>
+              </a:graphicData>
+            </a:graphic>
+          </wp:inline>
+        </w:drawing>
+      </w:r>
+      <w:r>
+        <w:rPr>
+          <w:noProof/>
+        </w:rPr>
+        <w:drawing>
+          <wp:inline distT="0" distB="0" distL="0" distR="0" wp14:anchorId="6346D2CA" wp14:editId="6171BDF4">
+            <wp:extent cx="6645910" cy="3895090"/>
+            <wp:effectExtent l="0" t="0" r="2540" b="0"/>
+            <wp:docPr id="859285364" name="Grafik 3"/>
+            <wp:cNvGraphicFramePr>
+              <a:graphicFrameLocks xmlns:a="http://schemas.openxmlformats.org/drawingml/2006/main" noChangeAspect="1"/>
+            </wp:cNvGraphicFramePr>
+            <a:graphic xmlns:a="http://schemas.openxmlformats.org/drawingml/2006/main">
+              <a:graphicData uri="http://schemas.openxmlformats.org/drawingml/2006/picture">
+                <pic:pic xmlns:pic="http://schemas.openxmlformats.org/drawingml/2006/picture">
+                  <pic:nvPicPr>
+                    <pic:cNvPr id="859285364" name="Grafik 859285364"/>
+                    <pic:cNvPicPr/>
+                  </pic:nvPicPr>
+                  <pic:blipFill>
+                    <a:blip r:embed="rId8">
+                      <a:extLst>
+                        <a:ext uri="{28A0092B-C50C-407E-A947-70E740481C1C}">
+                          <a14:useLocalDpi xmlns:a14="http://schemas.microsoft.com/office/drawing/2010/main" val="0"/>
+                        </a:ext>
+                      </a:extLst>
+                    </a:blip>
+                    <a:stretch>
+                      <a:fillRect/>
+                    </a:stretch>
+                  </pic:blipFill>
+                  <pic:spPr>
+                    <a:xfrm>
+                      <a:off x="0" y="0"/>
+                      <a:ext cx="6645910" cy="3895090"/>
+                    </a:xfrm>
+                    <a:prstGeom prst="rect">
+                      <a:avLst/>
+                    </a:prstGeom>
+                  </pic:spPr>
+                </pic:pic>
+              </a:graphicData>
+            </a:graphic>
+          </wp:inline>
+        </w:drawing>
+      </w:r>
+      <w:r>
+        <w:rPr>
+          <w:noProof/>
+        </w:rPr>
+        <w:lastRenderedPageBreak/>
+        <w:drawing>
+          <wp:inline distT="0" distB="0" distL="0" distR="0" wp14:anchorId="459D23B1" wp14:editId="2A2CD08A">
+            <wp:extent cx="1981477" cy="1448002"/>
+            <wp:effectExtent l="0" t="0" r="0" b="0"/>
+            <wp:docPr id="992762140" name="Grafik 4"/>
+            <wp:cNvGraphicFramePr>
+              <a:graphicFrameLocks xmlns:a="http://schemas.openxmlformats.org/drawingml/2006/main" noChangeAspect="1"/>
+            </wp:cNvGraphicFramePr>
+            <a:graphic xmlns:a="http://schemas.openxmlformats.org/drawingml/2006/main">
+              <a:graphicData uri="http://schemas.openxmlformats.org/drawingml/2006/picture">
+                <pic:pic xmlns:pic="http://schemas.openxmlformats.org/drawingml/2006/picture">
+                  <pic:nvPicPr>
+                    <pic:cNvPr id="992762140" name="Grafik 992762140"/>
+                    <pic:cNvPicPr/>
+                  </pic:nvPicPr>
+                  <pic:blipFill>
+                    <a:blip r:embed="rId9">
+                      <a:extLst>
+                        <a:ext uri="{28A0092B-C50C-407E-A947-70E740481C1C}">
+                          <a14:useLocalDpi xmlns:a14="http://schemas.microsoft.com/office/drawing/2010/main" val="0"/>
+                        </a:ext>
+                      </a:extLst>
+                    </a:blip>
+                    <a:stretch>
+                      <a:fillRect/>
+                    </a:stretch>
+                  </pic:blipFill>
+                  <pic:spPr>
+                    <a:xfrm>
+                      <a:off x="0" y="0"/>
+                      <a:ext cx="1981477" cy="1448002"/>
+                    </a:xfrm>
+                    <a:prstGeom prst="rect">
+                      <a:avLst/>
+                    </a:prstGeom>
+                  </pic:spPr>
+                </pic:pic>
+              </a:graphicData>
+            </a:graphic>
+          </wp:inline>
+        </w:drawing>
+      </w:r>
+      <w:r>
+        <w:rPr>
+          <w:noProof/>
+        </w:rPr>
+        <w:drawing>
+          <wp:inline distT="0" distB="0" distL="0" distR="0" wp14:anchorId="65DFA367" wp14:editId="5148D479">
+            <wp:extent cx="6645910" cy="3945255"/>
+            <wp:effectExtent l="0" t="0" r="2540" b="0"/>
+            <wp:docPr id="1144453092" name="Grafik 5"/>
+            <wp:cNvGraphicFramePr>
+              <a:graphicFrameLocks xmlns:a="http://schemas.openxmlformats.org/drawingml/2006/main" noChangeAspect="1"/>
+            </wp:cNvGraphicFramePr>
+            <a:graphic xmlns:a="http://schemas.openxmlformats.org/drawingml/2006/main">
+              <a:graphicData uri="http://schemas.openxmlformats.org/drawingml/2006/picture">
+                <pic:pic xmlns:pic="http://schemas.openxmlformats.org/drawingml/2006/picture">
+                  <pic:nvPicPr>
+                    <pic:cNvPr id="1144453092" name="Grafik 1144453092"/>
+                    <pic:cNvPicPr/>
+                  </pic:nvPicPr>
+                  <pic:blipFill>
+                    <a:blip r:embed="rId10">
+                      <a:extLst>
+                        <a:ext uri="{28A0092B-C50C-407E-A947-70E740481C1C}">
+                          <a14:useLocalDpi xmlns:a14="http://schemas.microsoft.com/office/drawing/2010/main" val="0"/>
+                        </a:ext>
+                      </a:extLst>
+                    </a:blip>
+                    <a:stretch>
+                      <a:fillRect/>
+                    </a:stretch>
+                  </pic:blipFill>
+                  <pic:spPr>
+                    <a:xfrm>
+                      <a:off x="0" y="0"/>
+                      <a:ext cx="6645910" cy="3945255"/>
+                    </a:xfrm>
+                    <a:prstGeom prst="rect">
+                      <a:avLst/>
+                    </a:prstGeom>
+                  </pic:spPr>
+                </pic:pic>
+              </a:graphicData>
+            </a:graphic>
+          </wp:inline>
+        </w:drawing>
+      </w:r>
+      <w:r>
+        <w:rPr>
+          <w:noProof/>
+        </w:rPr>
+        <w:drawing>
+          <wp:inline distT="0" distB="0" distL="0" distR="0" wp14:anchorId="21A759FF" wp14:editId="5321729B">
+            <wp:extent cx="6645910" cy="3945255"/>
+            <wp:effectExtent l="0" t="0" r="2540" b="0"/>
+            <wp:docPr id="324328366" name="Grafik 6"/>
+            <wp:cNvGraphicFramePr>
+              <a:graphicFrameLocks xmlns:a="http://schemas.openxmlformats.org/drawingml/2006/main" noChangeAspect="1"/>
+            </wp:cNvGraphicFramePr>
+            <a:graphic xmlns:a="http://schemas.openxmlformats.org/drawingml/2006/main">
+              <a:graphicData uri="http://schemas.openxmlformats.org/drawingml/2006/picture">
+                <pic:pic xmlns:pic="http://schemas.openxmlformats.org/drawingml/2006/picture">
+                  <pic:nvPicPr>
+                    <pic:cNvPr id="324328366" name="Grafik 324328366"/>
+                    <pic:cNvPicPr/>
+                  </pic:nvPicPr>
+                  <pic:blipFill>
+                    <a:blip r:embed="rId11">
+                      <a:extLst>
+                        <a:ext uri="{28A0092B-C50C-407E-A947-70E740481C1C}">
+                          <a14:useLocalDpi xmlns:a14="http://schemas.microsoft.com/office/drawing/2010/main" val="0"/>
+                        </a:ext>
+                      </a:extLst>
+                    </a:blip>
+                    <a:stretch>
+                      <a:fillRect/>
+                    </a:stretch>
+                  </pic:blipFill>
+                  <pic:spPr>
+                    <a:xfrm>
+                      <a:off x="0" y="0"/>
+                      <a:ext cx="6645910" cy="3945255"/>
+                    </a:xfrm>
+                    <a:prstGeom prst="rect">
+                      <a:avLst/>
+                    </a:prstGeom>
+                  </pic:spPr>
+                </pic:pic>
+              </a:graphicData>
+            </a:graphic>
+          </wp:inline>
+        </w:drawing>
+      </w:r>
+      <w:r>
+        <w:rPr>
+          <w:noProof/>
+        </w:rPr>
+        <w:lastRenderedPageBreak/>
+        <w:drawing>
+          <wp:inline distT="0" distB="0" distL="0" distR="0" wp14:anchorId="70052302" wp14:editId="0A015ADB">
+            <wp:extent cx="2495898" cy="1333686"/>
+            <wp:effectExtent l="0" t="0" r="0" b="0"/>
+            <wp:docPr id="690070789" name="Grafik 7"/>
+            <wp:cNvGraphicFramePr>
+              <a:graphicFrameLocks xmlns:a="http://schemas.openxmlformats.org/drawingml/2006/main" noChangeAspect="1"/>
+            </wp:cNvGraphicFramePr>
+            <a:graphic xmlns:a="http://schemas.openxmlformats.org/drawingml/2006/main">
+              <a:graphicData uri="http://schemas.openxmlformats.org/drawingml/2006/picture">
+                <pic:pic xmlns:pic="http://schemas.openxmlformats.org/drawingml/2006/picture">
+                  <pic:nvPicPr>
+                    <pic:cNvPr id="690070789" name="Grafik 690070789"/>
+                    <pic:cNvPicPr/>
+                  </pic:nvPicPr>
+                  <pic:blipFill>
+                    <a:blip r:embed="rId12">
+                      <a:extLst>
+                        <a:ext uri="{28A0092B-C50C-407E-A947-70E740481C1C}">
+                          <a14:useLocalDpi xmlns:a14="http://schemas.microsoft.com/office/drawing/2010/main" val="0"/>
+                        </a:ext>
+                      </a:extLst>
+                    </a:blip>
+                    <a:stretch>
+                      <a:fillRect/>
+                    </a:stretch>
+                  </pic:blipFill>
+                  <pic:spPr>
+                    <a:xfrm>
+                      <a:off x="0" y="0"/>
+                      <a:ext cx="2495898" cy="1333686"/>
+                    </a:xfrm>
+                    <a:prstGeom prst="rect">
+                      <a:avLst/>
+                    </a:prstGeom>
+                  </pic:spPr>
+                </pic:pic>
+              </a:graphicData>
+            </a:graphic>
+          </wp:inline>
+        </w:drawing>
+      </w:r>
+      <w:r>
+        <w:rPr>
+          <w:noProof/>
+        </w:rPr>
+        <w:drawing>
+          <wp:inline distT="0" distB="0" distL="0" distR="0" wp14:anchorId="757CA85A" wp14:editId="45368724">
+            <wp:extent cx="2934109" cy="1571844"/>
+            <wp:effectExtent l="0" t="0" r="0" b="9525"/>
+            <wp:docPr id="1431467836" name="Grafik 8"/>
+            <wp:cNvGraphicFramePr>
+              <a:graphicFrameLocks xmlns:a="http://schemas.openxmlformats.org/drawingml/2006/main" noChangeAspect="1"/>
+            </wp:cNvGraphicFramePr>
+            <a:graphic xmlns:a="http://schemas.openxmlformats.org/drawingml/2006/main">
+              <a:graphicData uri="http://schemas.openxmlformats.org/drawingml/2006/picture">
+                <pic:pic xmlns:pic="http://schemas.openxmlformats.org/drawingml/2006/picture">
+                  <pic:nvPicPr>
+                    <pic:cNvPr id="1431467836" name="Grafik 1431467836"/>
+                    <pic:cNvPicPr/>
+                  </pic:nvPicPr>
+                  <pic:blipFill>
+                    <a:blip r:embed="rId13">
+                      <a:extLst>
+                        <a:ext uri="{28A0092B-C50C-407E-A947-70E740481C1C}">
+                          <a14:useLocalDpi xmlns:a14="http://schemas.microsoft.com/office/drawing/2010/main" val="0"/>
+                        </a:ext>
+                      </a:extLst>
+                    </a:blip>
+                    <a:stretch>
+                      <a:fillRect/>
+                    </a:stretch>
+                  </pic:blipFill>
+                  <pic:spPr>
+                    <a:xfrm>
+                      <a:off x="0" y="0"/>
+                      <a:ext cx="2934109" cy="1571844"/>
+                    </a:xfrm>
+                    <a:prstGeom prst="rect">
+                      <a:avLst/>
+                    </a:prstGeom>
+                  </pic:spPr>
+                </pic:pic>
+              </a:graphicData>
+            </a:graphic>
+          </wp:inline>
+        </w:drawing>
+      </w:r>
+      <w:r>
+        <w:rPr>
+          <w:noProof/>
+        </w:rPr>
+        <w:drawing>
+          <wp:inline distT="0" distB="0" distL="0" distR="0" wp14:anchorId="7DFD750D" wp14:editId="761B4996">
+            <wp:extent cx="6645910" cy="3930650"/>
+            <wp:effectExtent l="0" t="0" r="2540" b="0"/>
+            <wp:docPr id="1619006295" name="Grafik 9"/>
+            <wp:cNvGraphicFramePr>
+              <a:graphicFrameLocks xmlns:a="http://schemas.openxmlformats.org/drawingml/2006/main" noChangeAspect="1"/>
+            </wp:cNvGraphicFramePr>
+            <a:graphic xmlns:a="http://schemas.openxmlformats.org/drawingml/2006/main">
+              <a:graphicData uri="http://schemas.openxmlformats.org/drawingml/2006/picture">
+                <pic:pic xmlns:pic="http://schemas.openxmlformats.org/drawingml/2006/picture">
+                  <pic:nvPicPr>
+                    <pic:cNvPr id="1619006295" name="Grafik 1619006295"/>
+                    <pic:cNvPicPr/>
+                  </pic:nvPicPr>
+                  <pic:blipFill>
+                    <a:blip r:embed="rId14">
+                      <a:extLst>
+                        <a:ext uri="{28A0092B-C50C-407E-A947-70E740481C1C}">
+                          <a14:useLocalDpi xmlns:a14="http://schemas.microsoft.com/office/drawing/2010/main" val="0"/>
+                        </a:ext>
+                      </a:extLst>
+                    </a:blip>
+                    <a:stretch>
+                      <a:fillRect/>
+                    </a:stretch>
+                  </pic:blipFill>
+                  <pic:spPr>
+                    <a:xfrm>
+                      <a:off x="0" y="0"/>
+                      <a:ext cx="6645910" cy="3930650"/>
+                    </a:xfrm>
+                    <a:prstGeom prst="rect">
+                      <a:avLst/>
+                    </a:prstGeom>
+                  </pic:spPr>
+                </pic:pic>
+              </a:graphicData>
+            </a:graphic>
+          </wp:inline>
+        </w:drawing>
+      </w:r>
+      <w:r>
+        <w:rPr>
+          <w:noProof/>
+        </w:rPr>
+        <w:lastRenderedPageBreak/>
+        <w:drawing>
+          <wp:inline distT="0" distB="0" distL="0" distR="0" wp14:anchorId="5C3AC6E1" wp14:editId="0FE2FAAD">
+            <wp:extent cx="2105319" cy="1333686"/>
+            <wp:effectExtent l="0" t="0" r="9525" b="0"/>
+            <wp:docPr id="538192713" name="Grafik 10"/>
+            <wp:cNvGraphicFramePr>
+              <a:graphicFrameLocks xmlns:a="http://schemas.openxmlformats.org/drawingml/2006/main" noChangeAspect="1"/>
+            </wp:cNvGraphicFramePr>
+            <a:graphic xmlns:a="http://schemas.openxmlformats.org/drawingml/2006/main">
+              <a:graphicData uri="http://schemas.openxmlformats.org/drawingml/2006/picture">
+                <pic:pic xmlns:pic="http://schemas.openxmlformats.org/drawingml/2006/picture">
+                  <pic:nvPicPr>
+                    <pic:cNvPr id="538192713" name="Grafik 538192713"/>
+                    <pic:cNvPicPr/>
+                  </pic:nvPicPr>
+                  <pic:blipFill>
+                    <a:blip r:embed="rId15">
+                      <a:extLst>
+                        <a:ext uri="{28A0092B-C50C-407E-A947-70E740481C1C}">
+                          <a14:useLocalDpi xmlns:a14="http://schemas.microsoft.com/office/drawing/2010/main" val="0"/>
+                        </a:ext>
+                      </a:extLst>
+                    </a:blip>
+                    <a:stretch>
+                      <a:fillRect/>
+                    </a:stretch>
+                  </pic:blipFill>
+                  <pic:spPr>
+                    <a:xfrm>
+                      <a:off x="0" y="0"/>
+                      <a:ext cx="2105319" cy="1333686"/>
+                    </a:xfrm>
+                    <a:prstGeom prst="rect">
+                      <a:avLst/>
+                    </a:prstGeom>
+                  </pic:spPr>
+                </pic:pic>
+              </a:graphicData>
+            </a:graphic>
+          </wp:inline>
+        </w:drawing>
+      </w:r>
+      <w:r>
+        <w:rPr>
+          <w:noProof/>
+        </w:rPr>
+        <w:drawing>
+          <wp:inline distT="0" distB="0" distL="0" distR="0" wp14:anchorId="544A775E" wp14:editId="493602F5">
+            <wp:extent cx="6645910" cy="3996690"/>
+            <wp:effectExtent l="0" t="0" r="2540" b="3810"/>
+            <wp:docPr id="1074282570" name="Grafik 11"/>
+            <wp:cNvGraphicFramePr>
+              <a:graphicFrameLocks xmlns:a="http://schemas.openxmlformats.org/drawingml/2006/main" noChangeAspect="1"/>
+            </wp:cNvGraphicFramePr>
+            <a:graphic xmlns:a="http://schemas.openxmlformats.org/drawingml/2006/main">
+              <a:graphicData uri="http://schemas.openxmlformats.org/drawingml/2006/picture">
+                <pic:pic xmlns:pic="http://schemas.openxmlformats.org/drawingml/2006/picture">
+                  <pic:nvPicPr>
+                    <pic:cNvPr id="1074282570" name="Grafik 1074282570"/>
+                    <pic:cNvPicPr/>
+                  </pic:nvPicPr>
+                  <pic:blipFill>
+                    <a:blip r:embed="rId16">
+                      <a:extLst>
+                        <a:ext uri="{28A0092B-C50C-407E-A947-70E740481C1C}">
+                          <a14:useLocalDpi xmlns:a14="http://schemas.microsoft.com/office/drawing/2010/main" val="0"/>
+                        </a:ext>
+                      </a:extLst>
+                    </a:blip>
+                    <a:stretch>
+                      <a:fillRect/>
+                    </a:stretch>
+                  </pic:blipFill>
+                  <pic:spPr>
+                    <a:xfrm>
+                      <a:off x="0" y="0"/>
+                      <a:ext cx="6645910" cy="3996690"/>
+                    </a:xfrm>
+                    <a:prstGeom prst="rect">
+                      <a:avLst/>
+                    </a:prstGeom>
+                  </pic:spPr>
+                </pic:pic>
+              </a:graphicData>
+            </a:graphic>
+          </wp:inline>
+        </w:drawing>
+      </w:r>
+    </w:p>
+    <w:p>
+      <w:r>
+        <w:rPr>
+          <w:noProof/>
+        </w:rPr>
+        <w:drawing>
+          <wp:inline distT="0" distB="0" distL="0" distR="0" wp14:anchorId="668AB29A" wp14:editId="32CCCB45">
+            <wp:extent cx="2295845" cy="1362265"/>
+            <wp:effectExtent l="0" t="0" r="9525" b="9525"/>
+            <wp:docPr id="553209769" name="Grafik 12"/>
+            <wp:cNvGraphicFramePr>
+              <a:graphicFrameLocks xmlns:a="http://schemas.openxmlformats.org/drawingml/2006/main" noChangeAspect="1"/>
+            </wp:cNvGraphicFramePr>
+            <a:graphic xmlns:a="http://schemas.openxmlformats.org/drawingml/2006/main">
+              <a:graphicData uri="http://schemas.openxmlformats.org/drawingml/2006/picture">
+                <pic:pic xmlns:pic="http://schemas.openxmlformats.org/drawingml/2006/picture">
+                  <pic:nvPicPr>
+                    <pic:cNvPr id="553209769" name="Grafik 553209769"/>
+                    <pic:cNvPicPr/>
+                  </pic:nvPicPr>
+                  <pic:blipFill>
+                    <a:blip r:embed="rId17">
+                      <a:extLst>
+                        <a:ext uri="{28A0092B-C50C-407E-A947-70E740481C1C}">
+                          <a14:useLocalDpi xmlns:a14="http://schemas.microsoft.com/office/drawing/2010/main" val="0"/>
+                        </a:ext>
+                      </a:extLst>
+                    </a:blip>
+                    <a:stretch>
+                      <a:fillRect/>
+                    </a:stretch>
+                  </pic:blipFill>
+                  <pic:spPr>
+                    <a:xfrm>
+                      <a:off x="0" y="0"/>
+                      <a:ext cx="2295845" cy="1362265"/>
+                    </a:xfrm>
+                    <a:prstGeom prst="rect">
+                      <a:avLst/>
+                    </a:prstGeom>
+                  </pic:spPr>
+                </pic:pic>
+              </a:graphicData>
+            </a:graphic>
+          </wp:inline>
+        </w:drawing>
+      </w:r>
+      <w:r>
+        <w:rPr>
+          <w:noProof/>
+        </w:rPr>
+        <w:drawing>
+          <wp:inline distT="0" distB="0" distL="0" distR="0" wp14:anchorId="4BF151FA" wp14:editId="212096A2">
+            <wp:extent cx="2419688" cy="1371791"/>
+            <wp:effectExtent l="0" t="0" r="0" b="0"/>
+            <wp:docPr id="1187126377" name="Grafik 13"/>
+            <wp:cNvGraphicFramePr>
+              <a:graphicFrameLocks xmlns:a="http://schemas.openxmlformats.org/drawingml/2006/main" noChangeAspect="1"/>
+            </wp:cNvGraphicFramePr>
+            <a:graphic xmlns:a="http://schemas.openxmlformats.org/drawingml/2006/main">
+              <a:graphicData uri="http://schemas.openxmlformats.org/drawingml/2006/picture">
+                <pic:pic xmlns:pic="http://schemas.openxmlformats.org/drawingml/2006/picture">
+                  <pic:nvPicPr>
+                    <pic:cNvPr id="1187126377" name="Grafik 1187126377"/>
+                    <pic:cNvPicPr/>
+                  </pic:nvPicPr>
+                  <pic:blipFill>
+                    <a:blip r:embed="rId18">
+                      <a:extLst>
+                        <a:ext uri="{28A0092B-C50C-407E-A947-70E740481C1C}">
+                          <a14:useLocalDpi xmlns:a14="http://schemas.microsoft.com/office/drawing/2010/main" val="0"/>
+                        </a:ext>
+                      </a:extLst>
+                    </a:blip>
+                    <a:stretch>
+                      <a:fillRect/>
+                    </a:stretch>
+                  </pic:blipFill>
+                  <pic:spPr>
+                    <a:xfrm>
+                      <a:off x="0" y="0"/>
+                      <a:ext cx="2419688" cy="1371791"/>
+                    </a:xfrm>
+                    <a:prstGeom prst="rect">
+                      <a:avLst/>
+                    </a:prstGeom>
+                  </pic:spPr>
+                </pic:pic>
+              </a:graphicData>
+            </a:graphic>
+          </wp:inline>
+        </w:drawing>
+      </w:r>
+      <w:r>
+        <w:rPr>
+          <w:noProof/>
+        </w:rPr>
+        <w:drawing>
+          <wp:inline distT="0" distB="0" distL="0" distR="0" wp14:anchorId="6615B5CA" wp14:editId="759EF06D">
+            <wp:extent cx="2372056" cy="1381318"/>
+            <wp:effectExtent l="0" t="0" r="9525" b="9525"/>
+            <wp:docPr id="1169397450" name="Grafik 14"/>
+            <wp:cNvGraphicFramePr>
+              <a:graphicFrameLocks xmlns:a="http://schemas.openxmlformats.org/drawingml/2006/main" noChangeAspect="1"/>
+            </wp:cNvGraphicFramePr>
+            <a:graphic xmlns:a="http://schemas.openxmlformats.org/drawingml/2006/main">
+              <a:graphicData uri="http://schemas.openxmlformats.org/drawingml/2006/picture">
+                <pic:pic xmlns:pic="http://schemas.openxmlformats.org/drawingml/2006/picture">
+                  <pic:nvPicPr>
+                    <pic:cNvPr id="1169397450" name="Grafik 1169397450"/>
+                    <pic:cNvPicPr/>
+                  </pic:nvPicPr>
+                  <pic:blipFill>
+                    <a:blip r:embed="rId19">
+                      <a:extLst>
+                        <a:ext uri="{28A0092B-C50C-407E-A947-70E740481C1C}">
+                          <a14:useLocalDpi xmlns:a14="http://schemas.microsoft.com/office/drawing/2010/main" val="0"/>
+                        </a:ext>
+                      </a:extLst>
+                    </a:blip>
+                    <a:stretch>
+                      <a:fillRect/>
+                    </a:stretch>
+                  </pic:blipFill>
+                  <pic:spPr>
+                    <a:xfrm>
+                      <a:off x="0" y="0"/>
+                      <a:ext cx="2372056" cy="1381318"/>
+                    </a:xfrm>
+                    <a:prstGeom prst="rect">
+                      <a:avLst/>
+                    </a:prstGeom>
+                  </pic:spPr>
+                </pic:pic>
+              </a:graphicData>
+            </a:graphic>
+          </wp:inline>
+        </w:drawing>
+      </w:r>
+      <w:r>
+        <w:rPr>
+          <w:noProof/>
+        </w:rPr>
+        <w:lastRenderedPageBreak/>
+        <w:drawing>
+          <wp:inline distT="0" distB="0" distL="0" distR="0" wp14:anchorId="79854CC4" wp14:editId="10C21758">
+            <wp:extent cx="6645910" cy="3980815"/>
+            <wp:effectExtent l="0" t="0" r="2540" b="635"/>
+            <wp:docPr id="1637015966" name="Grafik 15"/>
+            <wp:cNvGraphicFramePr>
+              <a:graphicFrameLocks xmlns:a="http://schemas.openxmlformats.org/drawingml/2006/main" noChangeAspect="1"/>
+            </wp:cNvGraphicFramePr>
+            <a:graphic xmlns:a="http://schemas.openxmlformats.org/drawingml/2006/main">
+              <a:graphicData uri="http://schemas.openxmlformats.org/drawingml/2006/picture">
+                <pic:pic xmlns:pic="http://schemas.openxmlformats.org/drawingml/2006/picture">
+                  <pic:nvPicPr>
+                    <pic:cNvPr id="1637015966" name="Grafik 1637015966"/>
+                    <pic:cNvPicPr/>
+                  </pic:nvPicPr>
+                  <pic:blipFill>
+                    <a:blip r:embed="rId20">
+                      <a:extLst>
+                        <a:ext uri="{28A0092B-C50C-407E-A947-70E740481C1C}">
+                          <a14:useLocalDpi xmlns:a14="http://schemas.microsoft.com/office/drawing/2010/main" val="0"/>
+                        </a:ext>
+                      </a:extLst>
+                    </a:blip>
+                    <a:stretch>
+                      <a:fillRect/>
+                    </a:stretch>
+                  </pic:blipFill>
+                  <pic:spPr>
+                    <a:xfrm>
+                      <a:off x="0" y="0"/>
+                      <a:ext cx="6645910" cy="3980815"/>
+                    </a:xfrm>
+                    <a:prstGeom prst="rect">
+                      <a:avLst/>
+                    </a:prstGeom>
+                  </pic:spPr>
+                </pic:pic>
+              </a:graphicData>
+            </a:graphic>
+          </wp:inline>
+        </w:drawing>
+      </w:r>
+      <w:r>
+        <w:rPr>
+          <w:noProof/>
+        </w:rPr>
+        <w:drawing>
+          <wp:inline distT="0" distB="0" distL="0" distR="0" wp14:anchorId="7B49931C" wp14:editId="01063C80">
+            <wp:extent cx="2219635" cy="3229426"/>
+            <wp:effectExtent l="0" t="0" r="9525" b="9525"/>
+            <wp:docPr id="833787721" name="Grafik 16"/>
+            <wp:cNvGraphicFramePr>
+              <a:graphicFrameLocks xmlns:a="http://schemas.openxmlformats.org/drawingml/2006/main" noChangeAspect="1"/>
+            </wp:cNvGraphicFramePr>
+            <a:graphic xmlns:a="http://schemas.openxmlformats.org/drawingml/2006/main">
+              <a:graphicData uri="http://schemas.openxmlformats.org/drawingml/2006/picture">
+                <pic:pic xmlns:pic="http://schemas.openxmlformats.org/drawingml/2006/picture">
+                  <pic:nvPicPr>
+                    <pic:cNvPr id="833787721" name="Grafik 833787721"/>
+                    <pic:cNvPicPr/>
+                  </pic:nvPicPr>
+                  <pic:blipFill>
+                    <a:blip r:embed="rId21">
+                      <a:extLst>
+                        <a:ext uri="{28A0092B-C50C-407E-A947-70E740481C1C}">
+                          <a14:useLocalDpi xmlns:a14="http://schemas.microsoft.com/office/drawing/2010/main" val="0"/>
+                        </a:ext>
+                      </a:extLst>
+                    </a:blip>
+                    <a:stretch>
+                      <a:fillRect/>
+                    </a:stretch>
+                  </pic:blipFill>
+                  <pic:spPr>
+                    <a:xfrm>
+                      <a:off x="0" y="0"/>
+                      <a:ext cx="2219635" cy="3229426"/>
+                    </a:xfrm>
+                    <a:prstGeom prst="rect">
+                      <a:avLst/>
+                    </a:prstGeom>
+                  </pic:spPr>
+                </pic:pic>
+              </a:graphicData>
+            </a:graphic>
+          </wp:inline>
+        </w:drawing>
+      </w:r>
+      <w:r>
+        <w:rPr>
+          <w:noProof/>
+        </w:rPr>
+        <w:lastRenderedPageBreak/>
+        <w:drawing>
+          <wp:inline distT="0" distB="0" distL="0" distR="0" wp14:anchorId="50E013F4" wp14:editId="5DBCFD39">
+            <wp:extent cx="6645910" cy="3972560"/>
+            <wp:effectExtent l="0" t="0" r="2540" b="8890"/>
+            <wp:docPr id="218871635" name="Grafik 17"/>
+            <wp:cNvGraphicFramePr>
+              <a:graphicFrameLocks xmlns:a="http://schemas.openxmlformats.org/drawingml/2006/main" noChangeAspect="1"/>
+            </wp:cNvGraphicFramePr>
+            <a:graphic xmlns:a="http://schemas.openxmlformats.org/drawingml/2006/main">
+              <a:graphicData uri="http://schemas.openxmlformats.org/drawingml/2006/picture">
+                <pic:pic xmlns:pic="http://schemas.openxmlformats.org/drawingml/2006/picture">
+                  <pic:nvPicPr>
+                    <pic:cNvPr id="218871635" name="Grafik 218871635"/>
+                    <pic:cNvPicPr/>
+                  </pic:nvPicPr>
+                  <pic:blipFill>
+                    <a:blip r:embed="rId22">
+                      <a:extLst>
+                        <a:ext uri="{28A0092B-C50C-407E-A947-70E740481C1C}">
+                          <a14:useLocalDpi xmlns:a14="http://schemas.microsoft.com/office/drawing/2010/main" val="0"/>
+                        </a:ext>
+                      </a:extLst>
+                    </a:blip>
+                    <a:stretch>
+                      <a:fillRect/>
+                    </a:stretch>
+                  </pic:blipFill>
+                  <pic:spPr>
+                    <a:xfrm>
+                      <a:off x="0" y="0"/>
+                      <a:ext cx="6645910" cy="3972560"/>
+                    </a:xfrm>
+                    <a:prstGeom prst="rect">
+                      <a:avLst/>
+                    </a:prstGeom>
+                  </pic:spPr>
+                </pic:pic>
+              </a:graphicData>
+            </a:graphic>
+          </wp:inline>
+        </w:drawing>
       </w:r>
     </w:p>
     <w:sectPr>

</xml_diff>